<commit_message>
docs(curriculum): validate S02 pilot and fix visual DOCX rendering
Co-Authored-By: Claude Sonnet 5 <noreply@anthropic.com>
</commit_message>
<xml_diff>
--- a/docs/seance-1-modele-validation/S01_APP_VI_ALL_support-visuel.docx
+++ b/docs/seance-1-modele-validation/S01_APP_VI_ALL_support-visuel.docx
@@ -85,151 +85,71 @@
           <w:sz w:val="19"/>
           <w:szCs w:val="19"/>
         </w:rPr>
-        <w:t xml:space="preserve">Observez le schéma représentatif des 5 thèmes civiques et répondez aux questions.</w:t>
-      </w:r>
-    </w:p>
-    <w:tbl>
-      <w:tblPr>
-        <w:tblW w:type="pct" w:w="100%"/>
-        <w:tblBorders>
-          <w:top w:val="single" w:color="auto" w:sz="4"/>
-          <w:left w:val="single" w:color="auto" w:sz="4"/>
-          <w:bottom w:val="single" w:color="auto" w:sz="4"/>
-          <w:right w:val="single" w:color="auto" w:sz="4"/>
-          <w:insideH w:val="single" w:color="auto" w:sz="4"/>
-          <w:insideV w:val="single" w:color="auto" w:sz="4"/>
-        </w:tblBorders>
-      </w:tblPr>
-      <w:tblGrid>
-        <w:gridCol w:w="100"/>
-        <w:gridCol w:w="100"/>
-        <w:gridCol w:w="100"/>
-        <w:gridCol w:w="100"/>
-        <w:gridCol w:w="100"/>
-      </w:tblGrid>
-      <w:tr>
-        <w:tc>
-          <w:tcPr>
-            <w:tcW w:type="pct" w:w="20%"/>
-          </w:tcPr>
-          <w:p>
-            <w:r>
-              <w:rPr>
-                <w:b/>
-                <w:bCs/>
-                <w:sz w:val="16"/>
-                <w:szCs w:val="16"/>
-              </w:rPr>
-              <w:t xml:space="preserve">Thème 1
-</w:t>
-            </w:r>
-            <w:r>
-              <w:rPr>
-                <w:sz w:val="14"/>
-                <w:szCs w:val="14"/>
-              </w:rPr>
-              <w:t xml:space="preserve">Principes et valeurs de la République</w:t>
-            </w:r>
-          </w:p>
-        </w:tc>
-        <w:tc>
-          <w:tcPr>
-            <w:tcW w:type="pct" w:w="20%"/>
-          </w:tcPr>
-          <w:p>
-            <w:r>
-              <w:rPr>
-                <w:b/>
-                <w:bCs/>
-                <w:sz w:val="16"/>
-                <w:szCs w:val="16"/>
-              </w:rPr>
-              <w:t xml:space="preserve">Thème 2
-</w:t>
-            </w:r>
-            <w:r>
-              <w:rPr>
-                <w:sz w:val="14"/>
-                <w:szCs w:val="14"/>
-              </w:rPr>
-              <w:t xml:space="preserve">Système institutionnel et politique</w:t>
-            </w:r>
-          </w:p>
-        </w:tc>
-        <w:tc>
-          <w:tcPr>
-            <w:tcW w:type="pct" w:w="20%"/>
-          </w:tcPr>
-          <w:p>
-            <w:r>
-              <w:rPr>
-                <w:b/>
-                <w:bCs/>
-                <w:sz w:val="16"/>
-                <w:szCs w:val="16"/>
-              </w:rPr>
-              <w:t xml:space="preserve">Thème 3
-</w:t>
-            </w:r>
-            <w:r>
-              <w:rPr>
-                <w:sz w:val="14"/>
-                <w:szCs w:val="14"/>
-              </w:rPr>
-              <w:t xml:space="preserve">Droits et devoirs</w:t>
-            </w:r>
-          </w:p>
-        </w:tc>
-        <w:tc>
-          <w:tcPr>
-            <w:tcW w:type="pct" w:w="20%"/>
-          </w:tcPr>
-          <w:p>
-            <w:r>
-              <w:rPr>
-                <w:b/>
-                <w:bCs/>
-                <w:sz w:val="16"/>
-                <w:szCs w:val="16"/>
-              </w:rPr>
-              <w:t xml:space="preserve">Thème 4
-</w:t>
-            </w:r>
-            <w:r>
-              <w:rPr>
-                <w:sz w:val="14"/>
-                <w:szCs w:val="14"/>
-              </w:rPr>
-              <w:t xml:space="preserve">Histoire, géographie et culture</w:t>
-            </w:r>
-          </w:p>
-        </w:tc>
-        <w:tc>
-          <w:tcPr>
-            <w:tcW w:type="pct" w:w="20%"/>
-          </w:tcPr>
-          <w:p>
-            <w:r>
-              <w:rPr>
-                <w:b/>
-                <w:bCs/>
-                <w:sz w:val="16"/>
-                <w:szCs w:val="16"/>
-              </w:rPr>
-              <w:t xml:space="preserve">Thème 5
-</w:t>
-            </w:r>
-            <w:r>
-              <w:rPr>
-                <w:sz w:val="14"/>
-                <w:szCs w:val="14"/>
-              </w:rPr>
-              <w:t xml:space="preserve">Vivre dans la société française</w:t>
-            </w:r>
-          </w:p>
-        </w:tc>
-      </w:tr>
-    </w:tbl>
+        <w:t xml:space="preserve">Observez attentivement le schéma ci-dessous, puis répondez aux questions.</w:t>
+      </w:r>
+    </w:p>
+    <w:p>
+      <w:pPr>
+        <w:spacing w:after="100" w:before="150"/>
+        <w:jc w:val="center"/>
+      </w:pPr>
+      <w:r>
+        <w:drawing>
+          <wp:inline distT="0" distB="0" distL="0" distR="0">
+            <wp:extent cx="4762500" cy="1371600"/>
+            <wp:effectExtent t="0" r="0" b="0" l="0"/>
+            <wp:docPr id="1" name="" descr="" title=""/>
+            <wp:cNvGraphicFramePr>
+              <a:graphicFrameLocks xmlns:a="http://schemas.openxmlformats.org/drawingml/2006/main" noChangeAspect="1"/>
+            </wp:cNvGraphicFramePr>
+            <a:graphic xmlns:a="http://schemas.openxmlformats.org/drawingml/2006/main">
+              <a:graphicData uri="http://schemas.openxmlformats.org/drawingml/2006/picture">
+                <pic:pic xmlns:pic="http://schemas.openxmlformats.org/drawingml/2006/picture">
+                  <pic:nvPicPr>
+                    <pic:cNvPr id="0" name="" descr=""/>
+                    <pic:cNvPicPr>
+                      <a:picLocks noChangeAspect="1" noChangeArrowheads="1"/>
+                    </pic:cNvPicPr>
+                  </pic:nvPicPr>
+                  <pic:blipFill>
+                    <a:blip r:embed="rId7" cstate="none"/>
+                    <a:srcRect/>
+                    <a:stretch>
+                      <a:fillRect/>
+                    </a:stretch>
+                  </pic:blipFill>
+                  <pic:spPr bwMode="auto">
+                    <a:xfrm>
+                      <a:off x="0" y="0"/>
+                      <a:ext cx="4762500" cy="1371600"/>
+                    </a:xfrm>
+                    <a:prstGeom prst="rect">
+                      <a:avLst/>
+                    </a:prstGeom>
+                  </pic:spPr>
+                </pic:pic>
+              </a:graphicData>
+            </a:graphic>
+          </wp:inline>
+        </w:drawing>
+      </w:r>
+    </w:p>
+    <w:p>
+      <w:pPr>
+        <w:spacing w:after="100" w:before="0"/>
+      </w:pPr>
+      <w:r>
+        <w:rPr>
+          <w:rFonts w:ascii="Arial" w:cs="Arial" w:eastAsia="Arial" w:hAnsi="Arial"/>
+          <w:b w:val="false"/>
+          <w:bCs w:val="false"/>
+          <w:color w:val="475569"/>
+          <w:sz w:val="18"/>
+          <w:szCs w:val="18"/>
+        </w:rPr>
+        <w:t xml:space="preserve">Figure 1 : Cinq thèmes civiques du parcours CapTCF</w:t>
+      </w:r>
+    </w:p>
     <w:p>
       <w:pPr>
         <w:spacing w:after="100" w:before="200"/>

</xml_diff>